<commit_message>
fix: fix Retrospective cycle 3
</commit_message>
<xml_diff>
--- a/docs/RetrospectivaC3.docx
+++ b/docs/RetrospectivaC3.docx
@@ -196,23 +196,15 @@
         </w:rPr>
       </w:pPr>
       <w:proofErr w:type="spellStart"/>
-      <w:r>
-        <w:rPr>
-          <w:rFonts w:ascii="Arial" w:hAnsi="Arial" w:cs="Arial"/>
-          <w:b/>
-          <w:bCs/>
-          <w:color w:val="0070C0"/>
-        </w:rPr>
-        <w:t>s</w:t>
-      </w:r>
-      <w:r>
-        <w:rPr>
-          <w:rFonts w:ascii="Arial" w:hAnsi="Arial" w:cs="Arial"/>
-          <w:b/>
-          <w:bCs/>
-          <w:color w:val="0070C0"/>
-        </w:rPr>
-        <w:t>lotMachine</w:t>
+      <w:proofErr w:type="gramStart"/>
+      <w:r>
+        <w:rPr>
+          <w:rFonts w:ascii="Arial" w:hAnsi="Arial" w:cs="Arial"/>
+          <w:b/>
+          <w:bCs/>
+          <w:color w:val="0070C0"/>
+        </w:rPr>
+        <w:t>slotMachine</w:t>
       </w:r>
       <w:proofErr w:type="spellEnd"/>
       <w:r>
@@ -225,6 +217,7 @@
         <w:t>(</w:t>
       </w:r>
       <w:proofErr w:type="spellStart"/>
+      <w:proofErr w:type="gramEnd"/>
       <w:r>
         <w:rPr>
           <w:rFonts w:ascii="Arial" w:hAnsi="Arial" w:cs="Arial"/>
@@ -376,6 +369,7 @@
           <w:lang w:val="en-US"/>
         </w:rPr>
       </w:pPr>
+      <w:proofErr w:type="gramStart"/>
       <w:r>
         <w:rPr>
           <w:rFonts w:ascii="Arial" w:hAnsi="Arial" w:cs="Arial"/>
@@ -384,7 +378,18 @@
           <w:color w:val="0070C0"/>
           <w:lang w:val="en-US"/>
         </w:rPr>
-        <w:t>solve(int n)</w:t>
+        <w:t>solve(</w:t>
+      </w:r>
+      <w:proofErr w:type="gramEnd"/>
+      <w:r>
+        <w:rPr>
+          <w:rFonts w:ascii="Arial" w:hAnsi="Arial" w:cs="Arial"/>
+          <w:b/>
+          <w:bCs/>
+          <w:color w:val="0070C0"/>
+          <w:lang w:val="en-US"/>
+        </w:rPr>
+        <w:t>int n)</w:t>
       </w:r>
     </w:p>
     <w:p>
@@ -495,6 +500,7 @@
           <w:lang w:val="en-US"/>
         </w:rPr>
       </w:pPr>
+      <w:proofErr w:type="gramStart"/>
       <w:r>
         <w:rPr>
           <w:rFonts w:ascii="Arial" w:hAnsi="Arial" w:cs="Arial"/>
@@ -503,7 +509,18 @@
           <w:color w:val="0070C0"/>
           <w:lang w:val="en-US"/>
         </w:rPr>
-        <w:t>simulate(int n)</w:t>
+        <w:t>simulate(</w:t>
+      </w:r>
+      <w:proofErr w:type="gramEnd"/>
+      <w:r>
+        <w:rPr>
+          <w:rFonts w:ascii="Arial" w:hAnsi="Arial" w:cs="Arial"/>
+          <w:b/>
+          <w:bCs/>
+          <w:color w:val="0070C0"/>
+          <w:lang w:val="en-US"/>
+        </w:rPr>
+        <w:t>int n)</w:t>
       </w:r>
     </w:p>
     <w:p>
@@ -665,7 +682,21 @@
           <w:rFonts w:ascii="Arial" w:hAnsi="Arial" w:cs="Arial"/>
           <w:color w:val="0070C0"/>
         </w:rPr>
-        <w:t xml:space="preserve"> a nivel del grupo sin embargo, </w:t>
+        <w:t xml:space="preserve"> a nivel del </w:t>
+      </w:r>
+      <w:r>
+        <w:rPr>
+          <w:rFonts w:ascii="Arial" w:hAnsi="Arial" w:cs="Arial"/>
+          <w:color w:val="0070C0"/>
+        </w:rPr>
+        <w:t>grupo</w:t>
+      </w:r>
+      <w:r>
+        <w:rPr>
+          <w:rFonts w:ascii="Arial" w:hAnsi="Arial" w:cs="Arial"/>
+          <w:color w:val="0070C0"/>
+        </w:rPr>
+        <w:t xml:space="preserve">, </w:t>
       </w:r>
       <w:r>
         <w:rPr>
@@ -695,8 +726,54 @@
           <w:rFonts w:ascii="Arial" w:hAnsi="Arial" w:cs="Arial"/>
           <w:color w:val="0070C0"/>
         </w:rPr>
-        <w:t xml:space="preserve"> no están implementados ya que no han subido ninguno</w:t>
-      </w:r>
+        <w:t xml:space="preserve"> </w:t>
+      </w:r>
+      <w:r>
+        <w:rPr>
+          <w:rFonts w:ascii="Arial" w:hAnsi="Arial" w:cs="Arial"/>
+          <w:color w:val="0070C0"/>
+        </w:rPr>
+        <w:t>también</w:t>
+      </w:r>
+      <w:r>
+        <w:rPr>
+          <w:rFonts w:ascii="Arial" w:hAnsi="Arial" w:cs="Arial"/>
+          <w:color w:val="0070C0"/>
+        </w:rPr>
+        <w:t xml:space="preserve"> están </w:t>
+      </w:r>
+      <w:proofErr w:type="gramStart"/>
+      <w:r>
+        <w:rPr>
+          <w:rFonts w:ascii="Arial" w:hAnsi="Arial" w:cs="Arial"/>
+          <w:color w:val="0070C0"/>
+        </w:rPr>
+        <w:t>implementados</w:t>
+      </w:r>
+      <w:proofErr w:type="gramEnd"/>
+      <w:r>
+        <w:rPr>
+          <w:rFonts w:ascii="Arial" w:hAnsi="Arial" w:cs="Arial"/>
+          <w:color w:val="0070C0"/>
+        </w:rPr>
+        <w:t xml:space="preserve"> </w:t>
+      </w:r>
+      <w:r>
+        <w:rPr>
+          <w:rFonts w:ascii="Arial" w:hAnsi="Arial" w:cs="Arial"/>
+          <w:color w:val="0070C0"/>
+        </w:rPr>
+        <w:t xml:space="preserve">pero no todos ya que cada uno </w:t>
+      </w:r>
+      <w:proofErr w:type="gramStart"/>
+      <w:r>
+        <w:rPr>
+          <w:rFonts w:ascii="Arial" w:hAnsi="Arial" w:cs="Arial"/>
+          <w:color w:val="0070C0"/>
+        </w:rPr>
+        <w:t>los implemento diferente</w:t>
+      </w:r>
+      <w:proofErr w:type="gramEnd"/>
       <w:r>
         <w:rPr>
           <w:rFonts w:ascii="Arial" w:hAnsi="Arial" w:cs="Arial"/>
@@ -723,7 +800,7 @@
           <w:rFonts w:ascii="Arial" w:hAnsi="Arial" w:cs="Arial"/>
           <w:color w:val="0070C0"/>
         </w:rPr>
-        <w:t xml:space="preserve">gracias al compromiso y dedicación </w:t>
+        <w:t xml:space="preserve">gracias al </w:t>
       </w:r>
       <w:r>
         <w:rPr>
@@ -731,7 +808,7 @@
           <w:color w:val="0070C0"/>
         </w:rPr>
         <w:lastRenderedPageBreak/>
-        <w:t>que se le dio a pensar en la solución y en el código más escalable desde el principio.</w:t>
+        <w:t>compromiso y dedicación que se le dio a pensar en la solución y en el código más escalable desde el principio.</w:t>
       </w:r>
     </w:p>
     <w:p>
@@ -769,7 +846,27 @@
           <w:bCs/>
           <w:color w:val="0070C0"/>
         </w:rPr>
-        <w:t xml:space="preserve">Elián Ibarra : </w:t>
+        <w:t xml:space="preserve">Elián </w:t>
+      </w:r>
+      <w:proofErr w:type="gramStart"/>
+      <w:r>
+        <w:rPr>
+          <w:rFonts w:ascii="Arial" w:hAnsi="Arial" w:cs="Arial"/>
+          <w:b/>
+          <w:bCs/>
+          <w:color w:val="0070C0"/>
+        </w:rPr>
+        <w:t>Ibarra :</w:t>
+      </w:r>
+      <w:proofErr w:type="gramEnd"/>
+      <w:r>
+        <w:rPr>
+          <w:rFonts w:ascii="Arial" w:hAnsi="Arial" w:cs="Arial"/>
+          <w:b/>
+          <w:bCs/>
+          <w:color w:val="0070C0"/>
+        </w:rPr>
+        <w:t xml:space="preserve"> </w:t>
       </w:r>
       <w:r>
         <w:rPr>
@@ -911,7 +1008,23 @@
           <w:rFonts w:ascii="Arial" w:hAnsi="Arial" w:cs="Arial"/>
           <w:color w:val="0070C0"/>
         </w:rPr>
-        <w:t>limpio y rápido. Esto porque era el principal propósito del proyecto desde el inicio al basarse en el contexto del problema de la maratón. A parte de eso también el poder verlo simulado y generar una solución de acuerdo a lo compartido en Moodle fue muy satisfactorio.</w:t>
+        <w:t xml:space="preserve">limpio y rápido. Esto porque era el principal propósito del proyecto desde el inicio al basarse en el contexto del problema de la maratón. A parte de eso también el poder verlo simulado y generar una solución </w:t>
+      </w:r>
+      <w:proofErr w:type="gramStart"/>
+      <w:r>
+        <w:rPr>
+          <w:rFonts w:ascii="Arial" w:hAnsi="Arial" w:cs="Arial"/>
+          <w:color w:val="0070C0"/>
+        </w:rPr>
+        <w:t>de acuerdo a</w:t>
+      </w:r>
+      <w:proofErr w:type="gramEnd"/>
+      <w:r>
+        <w:rPr>
+          <w:rFonts w:ascii="Arial" w:hAnsi="Arial" w:cs="Arial"/>
+          <w:color w:val="0070C0"/>
+        </w:rPr>
+        <w:t xml:space="preserve"> lo compartido en Moodle fue muy satisfactorio.</w:t>
       </w:r>
     </w:p>
     <w:p>
@@ -996,7 +1109,23 @@
           <w:rFonts w:ascii="Arial" w:hAnsi="Arial" w:cs="Arial"/>
           <w:color w:val="0070C0"/>
         </w:rPr>
-        <w:t>. Esto fue lo más difícil ya que muchas de las soluciones propuestas dadas solucionaban ciertas n ruedas pero no todas las n ruedas posibles y mas aun sabiendo que no había un patrón exacto en la combinación de ruedas que iba a aparecer en la máquina de acuerdo con el constructor que se creó. Lo que se hizo para resolverlo fue tener como base varias de las soluciones que se habían propuesto y se combino con lo observado en el video explicativo que está en Moodle y se implementó la solución de acuerdo con tal explicación según nuestro entendimiento.</w:t>
+        <w:t xml:space="preserve">. Esto fue lo más difícil ya que muchas de las soluciones propuestas dadas solucionaban ciertas n </w:t>
+      </w:r>
+      <w:proofErr w:type="gramStart"/>
+      <w:r>
+        <w:rPr>
+          <w:rFonts w:ascii="Arial" w:hAnsi="Arial" w:cs="Arial"/>
+          <w:color w:val="0070C0"/>
+        </w:rPr>
+        <w:t>ruedas</w:t>
+      </w:r>
+      <w:proofErr w:type="gramEnd"/>
+      <w:r>
+        <w:rPr>
+          <w:rFonts w:ascii="Arial" w:hAnsi="Arial" w:cs="Arial"/>
+          <w:color w:val="0070C0"/>
+        </w:rPr>
+        <w:t xml:space="preserve"> pero no todas las n ruedas posibles y mas aun sabiendo que no había un patrón exacto en la combinación de ruedas que iba a aparecer en la máquina de acuerdo con el constructor que se creó. Lo que se hizo para resolverlo fue tener como base varias de las soluciones que se habían propuesto y se combino con lo observado en el video explicativo que está en Moodle y se implementó la solución de acuerdo con tal explicación según nuestro entendimiento.</w:t>
       </w:r>
     </w:p>
     <w:p>
@@ -1292,13 +1421,23 @@
         <w:t xml:space="preserve"> — </w:t>
       </w:r>
       <w:proofErr w:type="spellStart"/>
+      <w:proofErr w:type="gramStart"/>
       <w:r>
         <w:rPr>
           <w:rStyle w:val="CdigoHTML"/>
           <w:rFonts w:eastAsiaTheme="minorHAnsi"/>
           <w:color w:val="0070C0"/>
         </w:rPr>
-        <w:t>java.util.Random</w:t>
+        <w:t>java.util</w:t>
+      </w:r>
+      <w:proofErr w:type="gramEnd"/>
+      <w:r>
+        <w:rPr>
+          <w:rStyle w:val="CdigoHTML"/>
+          <w:rFonts w:eastAsiaTheme="minorHAnsi"/>
+          <w:color w:val="0070C0"/>
+        </w:rPr>
+        <w:t>.Random</w:t>
       </w:r>
       <w:proofErr w:type="spellEnd"/>
       <w:r>
@@ -1415,6 +1554,7 @@
         <w:t xml:space="preserve"> </w:t>
       </w:r>
       <w:proofErr w:type="spellStart"/>
+      <w:proofErr w:type="gramStart"/>
       <w:r>
         <w:rPr>
           <w:rStyle w:val="CdigoHTML"/>
@@ -1431,6 +1571,7 @@
         <w:t>(</w:t>
       </w:r>
       <w:proofErr w:type="spellStart"/>
+      <w:proofErr w:type="gramEnd"/>
       <w:r>
         <w:rPr>
           <w:rStyle w:val="CdigoHTML"/>
@@ -1578,12 +1719,21 @@
         <w:t xml:space="preserve"> de </w:t>
       </w:r>
       <w:proofErr w:type="spellStart"/>
-      <w:r>
-        <w:rPr>
-          <w:rFonts w:ascii="Arial" w:hAnsi="Arial" w:cs="Arial"/>
-          <w:color w:val="0070C0"/>
-        </w:rPr>
-        <w:t>java.util.Formatter</w:t>
+      <w:proofErr w:type="gramStart"/>
+      <w:r>
+        <w:rPr>
+          <w:rFonts w:ascii="Arial" w:hAnsi="Arial" w:cs="Arial"/>
+          <w:color w:val="0070C0"/>
+        </w:rPr>
+        <w:t>java.util</w:t>
+      </w:r>
+      <w:proofErr w:type="gramEnd"/>
+      <w:r>
+        <w:rPr>
+          <w:rFonts w:ascii="Arial" w:hAnsi="Arial" w:cs="Arial"/>
+          <w:color w:val="0070C0"/>
+        </w:rPr>
+        <w:t>.Formatter</w:t>
       </w:r>
       <w:proofErr w:type="spellEnd"/>
       <w:r>
@@ -3994,6 +4144,7 @@
   <w:style w:type="character" w:default="1" w:styleId="Fuentedeprrafopredeter">
     <w:name w:val="Default Paragraph Font"/>
     <w:uiPriority w:val="1"/>
+    <w:semiHidden/>
     <w:unhideWhenUsed/>
   </w:style>
   <w:style w:type="table" w:default="1" w:styleId="Tablanormal">

</xml_diff>